<commit_message>
auto-snapshot 2026-06-11 11:54 (5 files)
</commit_message>
<xml_diff>
--- a/docs/proposals/proposal-sipera/Proposal_SIPERA.docx
+++ b/docs/proposals/proposal-sipera/Proposal_SIPERA.docx
@@ -382,7 +382,7 @@
           <w:color w:val="28A745"/>
           <w:sz w:val="24"/>
         </w:rPr>
-        <w:t>Artinya: dengan investasi Rp 110 juta, potensi tambahan PAD direct mencapai Rp 281 miliar — rasio ROI &gt;2.800× pada skenario realistis.</w:t>
+        <w:t>Artinya: dengan investasi Rp 100 juta, potensi tambahan PAD direct mencapai Rp 281 miliar — rasio ROI &gt;2.800× pada skenario realistis.</w:t>
       </w:r>
     </w:p>
     <w:p>
@@ -2107,7 +2107,7 @@
           </w:tcPr>
           <w:p>
             <w:r>
-              <w:t>Total ROI gabungan (Satelit+SIPERA Rp 260jt)</w:t>
+              <w:t>Total ROI gabungan (Satelit+SIPERA Rp 250jt)</w:t>
             </w:r>
           </w:p>
         </w:tc>
@@ -2117,7 +2117,7 @@
           </w:tcPr>
           <w:p>
             <w:r>
-              <w:t>~1.476× terhadap PAD Rp 383,8 M</w:t>
+              <w:t>~1.535× terhadap PAD Rp 383,8 M</w:t>
             </w:r>
           </w:p>
         </w:tc>
@@ -4491,7 +4491,7 @@
                 <w:color w:val="FFFFFF"/>
                 <w:sz w:val="26"/>
               </w:rPr>
-              <w:t>Rp 110.000.000</w:t>
+              <w:t>Rp 100.000.000</w:t>
             </w:r>
           </w:p>
         </w:tc>
@@ -4734,7 +4734,7 @@
               <w:rPr>
                 <w:b/>
               </w:rPr>
-              <w:t>TOTAL (A+B+C+D)</w:t>
+              <w:t>TOTAL (A+B)</w:t>
             </w:r>
           </w:p>
         </w:tc>
@@ -4748,7 +4748,7 @@
               <w:rPr>
                 <w:b/>
               </w:rPr>
-              <w:t>Rp 110.000.000</w:t>
+              <w:t>Rp 100.000.000</w:t>
             </w:r>
           </w:p>
         </w:tc>
@@ -4850,7 +4850,7 @@
           </w:tcPr>
           <w:p>
             <w:r>
-              <w:t>Rp 33.000.000</w:t>
+              <w:t>Rp 30.000.000</w:t>
             </w:r>
           </w:p>
         </w:tc>
@@ -4882,7 +4882,7 @@
           </w:tcPr>
           <w:p>
             <w:r>
-              <w:t>Rp 22.000.000</w:t>
+              <w:t>Rp 20.000.000</w:t>
             </w:r>
           </w:p>
         </w:tc>
@@ -4914,7 +4914,7 @@
           </w:tcPr>
           <w:p>
             <w:r>
-              <w:t>Rp 33.000.000</w:t>
+              <w:t>Rp 30.000.000</w:t>
             </w:r>
           </w:p>
         </w:tc>
@@ -4946,7 +4946,7 @@
           </w:tcPr>
           <w:p>
             <w:r>
-              <w:t>Rp 22.000.000</w:t>
+              <w:t>Rp 20.000.000</w:t>
             </w:r>
           </w:p>
         </w:tc>
@@ -5358,7 +5358,7 @@
           <w:i w:val="0"/>
           <w:sz w:val="22"/>
         </w:rPr>
-        <w:t>Proposal SIPERA menawarkan upgrade fondasi geospasial dari MVP enforcement (proposal satelit) ke platform production multi-kabupaten yang scalable. Dengan investasi Rp 110 juta, potensi tambahan PAD direct Kab. Bandung mencapai Rp 281 miliar (skenario realistis 10%) — ROI minimum 2.800× pada skenario realistis.</w:t>
+        <w:t>Proposal SIPERA menawarkan upgrade fondasi geospasial dari MVP enforcement (proposal satelit) ke platform production multi-kabupaten yang scalable. Dengan investasi Rp 100 juta, potensi tambahan PAD direct Kab. Bandung mencapai Rp 281 miliar (skenario realistis 10%) — ROI minimum 2.800× pada skenario realistis.</w:t>
       </w:r>
     </w:p>
     <w:p/>

</xml_diff>